<commit_message>
chore: Make architecture doc html
</commit_message>
<xml_diff>
--- a/docs/nasazeni-a-provoz.docx
+++ b/docs/nasazeni-a-provoz.docx
@@ -236,43 +236,7 @@
           <w:sz w:val="22"/>
           <w:szCs w:val="22"/>
         </w:rPr>
-        <w:t>Přehled pr</w:t>
-      </w:r>
-      <w:r>
-        <w:rPr>
-          <w:rStyle w:val="Hypertextovodkaz"/>
-          <w:rFonts w:ascii="Segoe UI" w:eastAsia="Times New Roman" w:hAnsi="Segoe UI" w:cs="Segoe UI"/>
-          <w:sz w:val="22"/>
-          <w:szCs w:val="22"/>
-        </w:rPr>
-        <w:t>o</w:t>
-      </w:r>
-      <w:r>
-        <w:rPr>
-          <w:rStyle w:val="Hypertextovodkaz"/>
-          <w:rFonts w:ascii="Segoe UI" w:eastAsia="Times New Roman" w:hAnsi="Segoe UI" w:cs="Segoe UI"/>
-          <w:sz w:val="22"/>
-          <w:szCs w:val="22"/>
-        </w:rPr>
-        <w:t>s</w:t>
-      </w:r>
-      <w:r>
-        <w:rPr>
-          <w:rStyle w:val="Hypertextovodkaz"/>
-          <w:rFonts w:ascii="Segoe UI" w:eastAsia="Times New Roman" w:hAnsi="Segoe UI" w:cs="Segoe UI"/>
-          <w:sz w:val="22"/>
-          <w:szCs w:val="22"/>
-        </w:rPr>
-        <w:t>t</w:t>
-      </w:r>
-      <w:r>
-        <w:rPr>
-          <w:rStyle w:val="Hypertextovodkaz"/>
-          <w:rFonts w:ascii="Segoe UI" w:eastAsia="Times New Roman" w:hAnsi="Segoe UI" w:cs="Segoe UI"/>
-          <w:sz w:val="22"/>
-          <w:szCs w:val="22"/>
-        </w:rPr>
-        <w:t>ředí</w:t>
+        <w:t>Přehled prostředí</w:t>
       </w:r>
     </w:p>
     <w:p>
@@ -307,25 +271,7 @@
             <w:sz w:val="22"/>
             <w:szCs w:val="22"/>
           </w:rPr>
-          <w:t>Požadavky na in</w:t>
-        </w:r>
-        <w:r>
-          <w:rPr>
-            <w:rStyle w:val="Hypertextovodkaz"/>
-            <w:rFonts w:ascii="Segoe UI" w:eastAsia="Times New Roman" w:hAnsi="Segoe UI" w:cs="Segoe UI"/>
-            <w:sz w:val="22"/>
-            <w:szCs w:val="22"/>
-          </w:rPr>
-          <w:t>f</w:t>
-        </w:r>
-        <w:r>
-          <w:rPr>
-            <w:rStyle w:val="Hypertextovodkaz"/>
-            <w:rFonts w:ascii="Segoe UI" w:eastAsia="Times New Roman" w:hAnsi="Segoe UI" w:cs="Segoe UI"/>
-            <w:sz w:val="22"/>
-            <w:szCs w:val="22"/>
-          </w:rPr>
-          <w:t>rastrukturu</w:t>
+          <w:t>Požadavky na infrastrukturu</w:t>
         </w:r>
       </w:hyperlink>
     </w:p>
@@ -574,25 +520,7 @@
             <w:sz w:val="22"/>
             <w:szCs w:val="22"/>
           </w:rPr>
-          <w:t xml:space="preserve">Monitoring </w:t>
-        </w:r>
-        <w:r>
-          <w:rPr>
-            <w:rStyle w:val="Hypertextovodkaz"/>
-            <w:rFonts w:ascii="Segoe UI" w:eastAsia="Times New Roman" w:hAnsi="Segoe UI" w:cs="Segoe UI"/>
-            <w:sz w:val="22"/>
-            <w:szCs w:val="22"/>
-          </w:rPr>
-          <w:t>a</w:t>
-        </w:r>
-        <w:r>
-          <w:rPr>
-            <w:rStyle w:val="Hypertextovodkaz"/>
-            <w:rFonts w:ascii="Segoe UI" w:eastAsia="Times New Roman" w:hAnsi="Segoe UI" w:cs="Segoe UI"/>
-            <w:sz w:val="22"/>
-            <w:szCs w:val="22"/>
-          </w:rPr>
-          <w:t xml:space="preserve"> logování</w:t>
+          <w:t>Monitoring a logování</w:t>
         </w:r>
       </w:hyperlink>
     </w:p>
@@ -15590,20 +15518,8 @@
           <w:szCs w:val="18"/>
           <w:shd w:val="clear" w:color="auto" w:fill="F0F4F8"/>
         </w:rPr>
-        <w:t xml:space="preserve">: </w:t>
-      </w:r>
-      <w:proofErr w:type="spellStart"/>
-      <w:r>
-        <w:rPr>
-          <w:rFonts w:ascii="Cascadia Code" w:hAnsi="Cascadia Code" w:cs="Cascadia Code"/>
-          <w:color w:val="1A1A2E"/>
-          <w:sz w:val="18"/>
-          <w:szCs w:val="18"/>
-          <w:shd w:val="clear" w:color="auto" w:fill="F0F4F8"/>
-        </w:rPr>
-        <w:t>flightlog</w:t>
-      </w:r>
-      <w:proofErr w:type="spellEnd"/>
+        <w:t>: flightlog</w:t>
+      </w:r>
     </w:p>
     <w:p>
       <w:pPr>
@@ -21131,6 +21047,106 @@
           <w:szCs w:val="18"/>
           <w:shd w:val="clear" w:color="auto" w:fill="F0F4F8"/>
         </w:rPr>
+        <w:t>: backup</w:t>
+      </w:r>
+    </w:p>
+    <w:p>
+      <w:pPr>
+        <w:pStyle w:val="FormtovanvHTML"/>
+        <w:rPr>
+          <w:rFonts w:ascii="Cascadia Code" w:hAnsi="Cascadia Code" w:cs="Cascadia Code"/>
+          <w:color w:val="1A1A2E"/>
+          <w:sz w:val="18"/>
+          <w:szCs w:val="18"/>
+          <w:shd w:val="clear" w:color="auto" w:fill="F0F4F8"/>
+        </w:rPr>
+      </w:pPr>
+      <w:r>
+        <w:rPr>
+          <w:rFonts w:ascii="Cascadia Code" w:hAnsi="Cascadia Code" w:cs="Cascadia Code"/>
+          <w:color w:val="1A1A2E"/>
+          <w:sz w:val="18"/>
+          <w:szCs w:val="18"/>
+          <w:shd w:val="clear" w:color="auto" w:fill="F0F4F8"/>
+        </w:rPr>
+        <w:t xml:space="preserve">                  </w:t>
+      </w:r>
+      <w:proofErr w:type="spellStart"/>
+      <w:r>
+        <w:rPr>
+          <w:rFonts w:ascii="Cascadia Code" w:hAnsi="Cascadia Code" w:cs="Cascadia Code"/>
+          <w:color w:val="1A1A2E"/>
+          <w:sz w:val="18"/>
+          <w:szCs w:val="18"/>
+          <w:shd w:val="clear" w:color="auto" w:fill="F0F4F8"/>
+        </w:rPr>
+        <w:t>mountPath</w:t>
+      </w:r>
+      <w:proofErr w:type="spellEnd"/>
+      <w:r>
+        <w:rPr>
+          <w:rFonts w:ascii="Cascadia Code" w:hAnsi="Cascadia Code" w:cs="Cascadia Code"/>
+          <w:color w:val="1A1A2E"/>
+          <w:sz w:val="18"/>
+          <w:szCs w:val="18"/>
+          <w:shd w:val="clear" w:color="auto" w:fill="F0F4F8"/>
+        </w:rPr>
+        <w:t>: /</w:t>
+      </w:r>
+      <w:proofErr w:type="spellStart"/>
+      <w:r>
+        <w:rPr>
+          <w:rFonts w:ascii="Cascadia Code" w:hAnsi="Cascadia Code" w:cs="Cascadia Code"/>
+          <w:color w:val="1A1A2E"/>
+          <w:sz w:val="18"/>
+          <w:szCs w:val="18"/>
+          <w:shd w:val="clear" w:color="auto" w:fill="F0F4F8"/>
+        </w:rPr>
+        <w:t>backup</w:t>
+      </w:r>
+      <w:proofErr w:type="spellEnd"/>
+    </w:p>
+    <w:p>
+      <w:pPr>
+        <w:pStyle w:val="FormtovanvHTML"/>
+        <w:rPr>
+          <w:rFonts w:ascii="Cascadia Code" w:hAnsi="Cascadia Code" w:cs="Cascadia Code"/>
+          <w:color w:val="1A1A2E"/>
+          <w:sz w:val="18"/>
+          <w:szCs w:val="18"/>
+          <w:shd w:val="clear" w:color="auto" w:fill="F0F4F8"/>
+        </w:rPr>
+      </w:pPr>
+      <w:r>
+        <w:rPr>
+          <w:rFonts w:ascii="Cascadia Code" w:hAnsi="Cascadia Code" w:cs="Cascadia Code"/>
+          <w:color w:val="1A1A2E"/>
+          <w:sz w:val="18"/>
+          <w:szCs w:val="18"/>
+          <w:shd w:val="clear" w:color="auto" w:fill="F0F4F8"/>
+        </w:rPr>
+        <w:t xml:space="preserve">          </w:t>
+      </w:r>
+      <w:proofErr w:type="spellStart"/>
+      <w:r>
+        <w:rPr>
+          <w:rFonts w:ascii="Cascadia Code" w:hAnsi="Cascadia Code" w:cs="Cascadia Code"/>
+          <w:color w:val="1A1A2E"/>
+          <w:sz w:val="18"/>
+          <w:szCs w:val="18"/>
+          <w:shd w:val="clear" w:color="auto" w:fill="F0F4F8"/>
+        </w:rPr>
+        <w:t>restartPolicy</w:t>
+      </w:r>
+      <w:proofErr w:type="spellEnd"/>
+      <w:r>
+        <w:rPr>
+          <w:rFonts w:ascii="Cascadia Code" w:hAnsi="Cascadia Code" w:cs="Cascadia Code"/>
+          <w:color w:val="1A1A2E"/>
+          <w:sz w:val="18"/>
+          <w:szCs w:val="18"/>
+          <w:shd w:val="clear" w:color="auto" w:fill="F0F4F8"/>
+        </w:rPr>
         <w:t xml:space="preserve">: </w:t>
       </w:r>
       <w:proofErr w:type="spellStart"/>
@@ -21142,7 +21158,7 @@
           <w:szCs w:val="18"/>
           <w:shd w:val="clear" w:color="auto" w:fill="F0F4F8"/>
         </w:rPr>
-        <w:t>backup</w:t>
+        <w:t>OnFailure</w:t>
       </w:r>
       <w:proofErr w:type="spellEnd"/>
     </w:p>
@@ -21165,42 +21181,30 @@
           <w:szCs w:val="18"/>
           <w:shd w:val="clear" w:color="auto" w:fill="F0F4F8"/>
         </w:rPr>
-        <w:t xml:space="preserve">                  </w:t>
-      </w:r>
-      <w:proofErr w:type="spellStart"/>
-      <w:r>
-        <w:rPr>
-          <w:rFonts w:ascii="Cascadia Code" w:hAnsi="Cascadia Code" w:cs="Cascadia Code"/>
-          <w:color w:val="1A1A2E"/>
-          <w:sz w:val="18"/>
-          <w:szCs w:val="18"/>
-          <w:shd w:val="clear" w:color="auto" w:fill="F0F4F8"/>
-        </w:rPr>
-        <w:t>mountPath</w:t>
-      </w:r>
-      <w:proofErr w:type="spellEnd"/>
-      <w:r>
-        <w:rPr>
-          <w:rFonts w:ascii="Cascadia Code" w:hAnsi="Cascadia Code" w:cs="Cascadia Code"/>
-          <w:color w:val="1A1A2E"/>
-          <w:sz w:val="18"/>
-          <w:szCs w:val="18"/>
-          <w:shd w:val="clear" w:color="auto" w:fill="F0F4F8"/>
-        </w:rPr>
-        <w:t>: /</w:t>
-      </w:r>
-      <w:proofErr w:type="spellStart"/>
-      <w:r>
-        <w:rPr>
-          <w:rFonts w:ascii="Cascadia Code" w:hAnsi="Cascadia Code" w:cs="Cascadia Code"/>
-          <w:color w:val="1A1A2E"/>
-          <w:sz w:val="18"/>
-          <w:szCs w:val="18"/>
-          <w:shd w:val="clear" w:color="auto" w:fill="F0F4F8"/>
-        </w:rPr>
-        <w:t>backup</w:t>
-      </w:r>
-      <w:proofErr w:type="spellEnd"/>
+        <w:t xml:space="preserve">          </w:t>
+      </w:r>
+      <w:proofErr w:type="spellStart"/>
+      <w:r>
+        <w:rPr>
+          <w:rFonts w:ascii="Cascadia Code" w:hAnsi="Cascadia Code" w:cs="Cascadia Code"/>
+          <w:color w:val="1A1A2E"/>
+          <w:sz w:val="18"/>
+          <w:szCs w:val="18"/>
+          <w:shd w:val="clear" w:color="auto" w:fill="F0F4F8"/>
+        </w:rPr>
+        <w:t>volumes</w:t>
+      </w:r>
+      <w:proofErr w:type="spellEnd"/>
+      <w:r>
+        <w:rPr>
+          <w:rFonts w:ascii="Cascadia Code" w:hAnsi="Cascadia Code" w:cs="Cascadia Code"/>
+          <w:color w:val="1A1A2E"/>
+          <w:sz w:val="18"/>
+          <w:szCs w:val="18"/>
+          <w:shd w:val="clear" w:color="auto" w:fill="F0F4F8"/>
+        </w:rPr>
+        <w:t>:</w:t>
+      </w:r>
     </w:p>
     <w:p>
       <w:pPr>
@@ -21221,106 +21225,6 @@
           <w:szCs w:val="18"/>
           <w:shd w:val="clear" w:color="auto" w:fill="F0F4F8"/>
         </w:rPr>
-        <w:t xml:space="preserve">          </w:t>
-      </w:r>
-      <w:proofErr w:type="spellStart"/>
-      <w:r>
-        <w:rPr>
-          <w:rFonts w:ascii="Cascadia Code" w:hAnsi="Cascadia Code" w:cs="Cascadia Code"/>
-          <w:color w:val="1A1A2E"/>
-          <w:sz w:val="18"/>
-          <w:szCs w:val="18"/>
-          <w:shd w:val="clear" w:color="auto" w:fill="F0F4F8"/>
-        </w:rPr>
-        <w:t>restartPolicy</w:t>
-      </w:r>
-      <w:proofErr w:type="spellEnd"/>
-      <w:r>
-        <w:rPr>
-          <w:rFonts w:ascii="Cascadia Code" w:hAnsi="Cascadia Code" w:cs="Cascadia Code"/>
-          <w:color w:val="1A1A2E"/>
-          <w:sz w:val="18"/>
-          <w:szCs w:val="18"/>
-          <w:shd w:val="clear" w:color="auto" w:fill="F0F4F8"/>
-        </w:rPr>
-        <w:t xml:space="preserve">: </w:t>
-      </w:r>
-      <w:proofErr w:type="spellStart"/>
-      <w:r>
-        <w:rPr>
-          <w:rFonts w:ascii="Cascadia Code" w:hAnsi="Cascadia Code" w:cs="Cascadia Code"/>
-          <w:color w:val="1A1A2E"/>
-          <w:sz w:val="18"/>
-          <w:szCs w:val="18"/>
-          <w:shd w:val="clear" w:color="auto" w:fill="F0F4F8"/>
-        </w:rPr>
-        <w:t>OnFailure</w:t>
-      </w:r>
-      <w:proofErr w:type="spellEnd"/>
-    </w:p>
-    <w:p>
-      <w:pPr>
-        <w:pStyle w:val="FormtovanvHTML"/>
-        <w:rPr>
-          <w:rFonts w:ascii="Cascadia Code" w:hAnsi="Cascadia Code" w:cs="Cascadia Code"/>
-          <w:color w:val="1A1A2E"/>
-          <w:sz w:val="18"/>
-          <w:szCs w:val="18"/>
-          <w:shd w:val="clear" w:color="auto" w:fill="F0F4F8"/>
-        </w:rPr>
-      </w:pPr>
-      <w:r>
-        <w:rPr>
-          <w:rFonts w:ascii="Cascadia Code" w:hAnsi="Cascadia Code" w:cs="Cascadia Code"/>
-          <w:color w:val="1A1A2E"/>
-          <w:sz w:val="18"/>
-          <w:szCs w:val="18"/>
-          <w:shd w:val="clear" w:color="auto" w:fill="F0F4F8"/>
-        </w:rPr>
-        <w:t xml:space="preserve">          </w:t>
-      </w:r>
-      <w:proofErr w:type="spellStart"/>
-      <w:r>
-        <w:rPr>
-          <w:rFonts w:ascii="Cascadia Code" w:hAnsi="Cascadia Code" w:cs="Cascadia Code"/>
-          <w:color w:val="1A1A2E"/>
-          <w:sz w:val="18"/>
-          <w:szCs w:val="18"/>
-          <w:shd w:val="clear" w:color="auto" w:fill="F0F4F8"/>
-        </w:rPr>
-        <w:t>volumes</w:t>
-      </w:r>
-      <w:proofErr w:type="spellEnd"/>
-      <w:r>
-        <w:rPr>
-          <w:rFonts w:ascii="Cascadia Code" w:hAnsi="Cascadia Code" w:cs="Cascadia Code"/>
-          <w:color w:val="1A1A2E"/>
-          <w:sz w:val="18"/>
-          <w:szCs w:val="18"/>
-          <w:shd w:val="clear" w:color="auto" w:fill="F0F4F8"/>
-        </w:rPr>
-        <w:t>:</w:t>
-      </w:r>
-    </w:p>
-    <w:p>
-      <w:pPr>
-        <w:pStyle w:val="FormtovanvHTML"/>
-        <w:rPr>
-          <w:rFonts w:ascii="Cascadia Code" w:hAnsi="Cascadia Code" w:cs="Cascadia Code"/>
-          <w:color w:val="1A1A2E"/>
-          <w:sz w:val="18"/>
-          <w:szCs w:val="18"/>
-          <w:shd w:val="clear" w:color="auto" w:fill="F0F4F8"/>
-        </w:rPr>
-      </w:pPr>
-      <w:r>
-        <w:rPr>
-          <w:rFonts w:ascii="Cascadia Code" w:hAnsi="Cascadia Code" w:cs="Cascadia Code"/>
-          <w:color w:val="1A1A2E"/>
-          <w:sz w:val="18"/>
-          <w:szCs w:val="18"/>
-          <w:shd w:val="clear" w:color="auto" w:fill="F0F4F8"/>
-        </w:rPr>
         <w:t xml:space="preserve">            - </w:t>
       </w:r>
       <w:proofErr w:type="spellStart"/>
@@ -21343,20 +21247,8 @@
           <w:szCs w:val="18"/>
           <w:shd w:val="clear" w:color="auto" w:fill="F0F4F8"/>
         </w:rPr>
-        <w:t xml:space="preserve">: </w:t>
-      </w:r>
-      <w:proofErr w:type="spellStart"/>
-      <w:r>
-        <w:rPr>
-          <w:rFonts w:ascii="Cascadia Code" w:hAnsi="Cascadia Code" w:cs="Cascadia Code"/>
-          <w:color w:val="1A1A2E"/>
-          <w:sz w:val="18"/>
-          <w:szCs w:val="18"/>
-          <w:shd w:val="clear" w:color="auto" w:fill="F0F4F8"/>
-        </w:rPr>
-        <w:t>backup</w:t>
-      </w:r>
-      <w:proofErr w:type="spellEnd"/>
+        <w:t>: backup</w:t>
+      </w:r>
     </w:p>
     <w:p>
       <w:pPr>
@@ -37807,115 +37699,6 @@
         <w:pict w14:anchorId="5BB209F9">
           <v:rect id="_x0000_i1038" style="width:0;height:1.5pt" o:hralign="center" o:hrstd="t" o:hr="t" fillcolor="#a0a0a0" stroked="f"/>
         </w:pict>
-      </w:r>
-    </w:p>
-    <w:p>
-      <w:pPr>
-        <w:pStyle w:val="Normlnweb"/>
-        <w:rPr>
-          <w:rFonts w:ascii="Segoe UI" w:hAnsi="Segoe UI" w:cs="Segoe UI"/>
-          <w:color w:val="1A1A2E"/>
-          <w:sz w:val="22"/>
-          <w:szCs w:val="22"/>
-        </w:rPr>
-      </w:pPr>
-      <w:r>
-        <w:rPr>
-          <w:rStyle w:val="Zdraznn"/>
-          <w:rFonts w:ascii="Segoe UI" w:hAnsi="Segoe UI" w:cs="Segoe UI"/>
-          <w:color w:val="1A1A2E"/>
-          <w:sz w:val="22"/>
-          <w:szCs w:val="22"/>
-        </w:rPr>
-        <w:t xml:space="preserve">Dokument byl vytvořen na základě analýzy zdrojového kódu, </w:t>
-      </w:r>
-      <w:proofErr w:type="spellStart"/>
-      <w:r>
-        <w:rPr>
-          <w:rStyle w:val="Zdraznn"/>
-          <w:rFonts w:ascii="Segoe UI" w:hAnsi="Segoe UI" w:cs="Segoe UI"/>
-          <w:color w:val="1A1A2E"/>
-          <w:sz w:val="22"/>
-          <w:szCs w:val="22"/>
-        </w:rPr>
-        <w:t>Dockerfile</w:t>
-      </w:r>
-      <w:proofErr w:type="spellEnd"/>
-      <w:r>
-        <w:rPr>
-          <w:rStyle w:val="Zdraznn"/>
-          <w:rFonts w:ascii="Segoe UI" w:hAnsi="Segoe UI" w:cs="Segoe UI"/>
-          <w:color w:val="1A1A2E"/>
-          <w:sz w:val="22"/>
-          <w:szCs w:val="22"/>
-        </w:rPr>
-        <w:t xml:space="preserve">, </w:t>
-      </w:r>
-      <w:proofErr w:type="spellStart"/>
-      <w:r>
-        <w:rPr>
-          <w:rStyle w:val="Zdraznn"/>
-          <w:rFonts w:ascii="Segoe UI" w:hAnsi="Segoe UI" w:cs="Segoe UI"/>
-          <w:color w:val="1A1A2E"/>
-          <w:sz w:val="22"/>
-          <w:szCs w:val="22"/>
-        </w:rPr>
-        <w:t>docker-compose.yml</w:t>
-      </w:r>
-      <w:proofErr w:type="spellEnd"/>
-      <w:r>
-        <w:rPr>
-          <w:rStyle w:val="Zdraznn"/>
-          <w:rFonts w:ascii="Segoe UI" w:hAnsi="Segoe UI" w:cs="Segoe UI"/>
-          <w:color w:val="1A1A2E"/>
-          <w:sz w:val="22"/>
-          <w:szCs w:val="22"/>
-        </w:rPr>
-        <w:t xml:space="preserve"> a </w:t>
-      </w:r>
-      <w:proofErr w:type="spellStart"/>
-      <w:r>
-        <w:rPr>
-          <w:rStyle w:val="Zdraznn"/>
-          <w:rFonts w:ascii="Segoe UI" w:hAnsi="Segoe UI" w:cs="Segoe UI"/>
-          <w:color w:val="1A1A2E"/>
-          <w:sz w:val="22"/>
-          <w:szCs w:val="22"/>
-        </w:rPr>
-        <w:t>Kubernetes</w:t>
-      </w:r>
-      <w:proofErr w:type="spellEnd"/>
-      <w:r>
-        <w:rPr>
-          <w:rStyle w:val="Zdraznn"/>
-          <w:rFonts w:ascii="Segoe UI" w:hAnsi="Segoe UI" w:cs="Segoe UI"/>
-          <w:color w:val="1A1A2E"/>
-          <w:sz w:val="22"/>
-          <w:szCs w:val="22"/>
-        </w:rPr>
-        <w:t xml:space="preserve"> manifestů projektu </w:t>
-      </w:r>
-      <w:proofErr w:type="spellStart"/>
-      <w:r>
-        <w:rPr>
-          <w:rStyle w:val="Zdraznn"/>
-          <w:rFonts w:ascii="Segoe UI" w:hAnsi="Segoe UI" w:cs="Segoe UI"/>
-          <w:color w:val="1A1A2E"/>
-          <w:sz w:val="22"/>
-          <w:szCs w:val="22"/>
-        </w:rPr>
-        <w:t>flight</w:t>
-      </w:r>
-      <w:proofErr w:type="spellEnd"/>
-      <w:r>
-        <w:rPr>
-          <w:rStyle w:val="Zdraznn"/>
-          <w:rFonts w:ascii="Segoe UI" w:hAnsi="Segoe UI" w:cs="Segoe UI"/>
-          <w:color w:val="1A1A2E"/>
-          <w:sz w:val="22"/>
-          <w:szCs w:val="22"/>
-        </w:rPr>
-        <w:t>-log-kotlin.</w:t>
       </w:r>
     </w:p>
     <w:sectPr>

</xml_diff>